<commit_message>
fixtures: add missing word/styles.xml to docx fixtures; test they import
Co-Authored-By: Claude Sonnet 5.5 <noreply@anthropic.com>
</commit_message>
<xml_diff>
--- a/fixtures/docx/minimal_valid.docx
+++ b/fixtures/docx/minimal_valid.docx
@@ -37,4 +37,12 @@
     <w:sectPr/>
   </w:body>
 </w:document>
+</file>
+
+<file path=word/styles.xml><?xml version="1.0" encoding="utf-8"?>
+<w:styles xmlns:w="http://schemas.openxmlformats.org/wordprocessingml/2006/main">
+  <w:style w:type="paragraph" w:default="1" w:styleId="Normal">
+    <w:name w:val="Normal"/>
+  </w:style>
+</w:styles>
 </file>
</xml_diff>